<commit_message>
Respaldos .gio version 5 faltan pruebas de rendimiento y seguridad
</commit_message>
<xml_diff>
--- a/Pruebas/Proyecto  Respaldoa.docx
+++ b/Pruebas/Proyecto  Respaldoa.docx
@@ -12,6 +12,7 @@
         </w:rPr>
       </w:pPr>
       <w:bookmarkStart w:id="0" w:name="_Hlk215849748"/>
+      <w:bookmarkStart w:id="1" w:name="_Hlk235891582"/>
       <w:r>
         <w:rPr>
           <w:rFonts w:cs="Arial"/>
@@ -238,7 +239,15 @@
           <w:sz w:val="48"/>
           <w:szCs w:val="48"/>
         </w:rPr>
-        <w:t xml:space="preserve"> 2.1,3.1.2</w:t>
+        <w:t xml:space="preserve"> 2.1,3.</w:t>
+      </w:r>
+      <w:r>
+        <w:rPr>
+          <w:rFonts w:cs="Arial"/>
+          <w:sz w:val="48"/>
+          <w:szCs w:val="48"/>
+        </w:rPr>
+        <w:t>0, 4.0, 4.1</w:t>
       </w:r>
     </w:p>
     <w:p>
@@ -301,7 +310,8 @@
       </w:hyperlink>
       <w:bookmarkEnd w:id="0"/>
     </w:p>
-    <w:bookmarkStart w:id="1" w:name="_Toc212111551" w:displacedByCustomXml="next"/>
+    <w:bookmarkEnd w:id="1" w:displacedByCustomXml="next"/>
+    <w:bookmarkStart w:id="2" w:name="_Toc212111551" w:displacedByCustomXml="next"/>
     <w:sdt>
       <w:sdtPr>
         <w:rPr>
@@ -333,7 +343,7 @@
           <w:r>
             <w:t>Índice</w:t>
           </w:r>
-          <w:bookmarkEnd w:id="1"/>
+          <w:bookmarkEnd w:id="2"/>
         </w:p>
         <w:p>
           <w:pPr>
@@ -3968,8 +3978,8 @@
       </w:sdtContent>
     </w:sdt>
     <w:p>
-      <w:bookmarkStart w:id="2" w:name="_Toc212111552"/>
-      <w:bookmarkStart w:id="3" w:name="_Hlk215849900"/>
+      <w:bookmarkStart w:id="3" w:name="_Toc212111552"/>
+      <w:bookmarkStart w:id="4" w:name="_Hlk215849900"/>
       <w:r>
         <w:rPr>
           <w:rStyle w:val="Ttulo1Car"/>
@@ -3977,14 +3987,14 @@
         <w:lastRenderedPageBreak/>
         <w:t>Introducción</w:t>
       </w:r>
-      <w:bookmarkEnd w:id="2"/>
+      <w:bookmarkEnd w:id="3"/>
       <w:r>
         <w:rPr>
           <w:rStyle w:val="Ttulo1Car"/>
         </w:rPr>
         <w:br/>
       </w:r>
-      <w:bookmarkEnd w:id="3"/>
+      <w:bookmarkEnd w:id="4"/>
       <w:r>
         <w:t>Debemos crear un sistema que nos ayude a vaciar una PC, tomando en cuenta las carpetas donde el usuario normalmente guarda sus documentos.</w:t>
       </w:r>
@@ -4008,14 +4018,14 @@
           <w:rStyle w:val="Ttulo1Car"/>
         </w:rPr>
       </w:pPr>
-      <w:bookmarkStart w:id="4" w:name="_Toc212111553"/>
+      <w:bookmarkStart w:id="5" w:name="_Toc212111553"/>
       <w:r>
         <w:rPr>
           <w:rStyle w:val="Ttulo1Car"/>
         </w:rPr>
         <w:t>Planteamiento del problema</w:t>
       </w:r>
-      <w:bookmarkEnd w:id="4"/>
+      <w:bookmarkEnd w:id="5"/>
     </w:p>
     <w:p>
       <w:pPr>
@@ -4053,14 +4063,14 @@
           <w:rStyle w:val="Ttulo2Car"/>
         </w:rPr>
       </w:pPr>
-      <w:bookmarkStart w:id="5" w:name="_Toc212111554"/>
+      <w:bookmarkStart w:id="6" w:name="_Toc212111554"/>
       <w:r>
         <w:rPr>
           <w:rStyle w:val="Ttulo2Car"/>
         </w:rPr>
         <w:t>Objetivo general</w:t>
       </w:r>
-      <w:bookmarkEnd w:id="5"/>
+      <w:bookmarkEnd w:id="6"/>
     </w:p>
     <w:p>
       <w:pPr>
@@ -4081,11 +4091,11 @@
       <w:pPr>
         <w:pStyle w:val="Ttulo2"/>
       </w:pPr>
-      <w:bookmarkStart w:id="6" w:name="_Toc212111555"/>
+      <w:bookmarkStart w:id="7" w:name="_Toc212111555"/>
       <w:r>
         <w:t>Objetivos específicos</w:t>
       </w:r>
-      <w:bookmarkEnd w:id="6"/>
+      <w:bookmarkEnd w:id="7"/>
     </w:p>
     <w:p>
       <w:pPr>
@@ -4193,14 +4203,14 @@
           <w14:ligatures w14:val="standardContextual"/>
         </w:rPr>
       </w:pPr>
-      <w:bookmarkStart w:id="7" w:name="_Toc212111556"/>
+      <w:bookmarkStart w:id="8" w:name="_Toc212111556"/>
       <w:r>
         <w:rPr>
           <w:rStyle w:val="Ttulo2Car"/>
         </w:rPr>
         <w:t>Alcance</w:t>
       </w:r>
-      <w:bookmarkEnd w:id="7"/>
+      <w:bookmarkEnd w:id="8"/>
       <w:r>
         <w:rPr>
           <w:rStyle w:val="Ttulo2Car"/>
@@ -4269,20 +4279,21 @@
       <w:pPr>
         <w:pStyle w:val="Ttulo1"/>
       </w:pPr>
-      <w:bookmarkStart w:id="8" w:name="_Toc212111557"/>
+      <w:bookmarkStart w:id="9" w:name="_Toc212111557"/>
+      <w:bookmarkStart w:id="10" w:name="_Hlk235892975"/>
       <w:r>
         <w:t>Metodología</w:t>
       </w:r>
-      <w:bookmarkEnd w:id="8"/>
-    </w:p>
-    <w:p>
-      <w:pPr>
-        <w:rPr>
-          <w:rFonts w:cs="Arial"/>
-          <w:szCs w:val="24"/>
-        </w:rPr>
-      </w:pPr>
-      <w:bookmarkStart w:id="9" w:name="_Hlk215855372"/>
+      <w:bookmarkEnd w:id="9"/>
+    </w:p>
+    <w:p>
+      <w:pPr>
+        <w:rPr>
+          <w:rFonts w:cs="Arial"/>
+          <w:szCs w:val="24"/>
+        </w:rPr>
+      </w:pPr>
+      <w:bookmarkStart w:id="11" w:name="_Hlk215855372"/>
       <w:r>
         <w:rPr>
           <w:rFonts w:cs="Arial"/>
@@ -4295,11 +4306,11 @@
       <w:pPr>
         <w:pStyle w:val="Ttulo2"/>
       </w:pPr>
-      <w:bookmarkStart w:id="10" w:name="_Toc212111558"/>
+      <w:bookmarkStart w:id="12" w:name="_Toc212111558"/>
       <w:r>
         <w:t>Metodología de desarrollo Ágil Scrum</w:t>
       </w:r>
-      <w:bookmarkEnd w:id="10"/>
+      <w:bookmarkEnd w:id="12"/>
     </w:p>
     <w:p>
       <w:pPr>
@@ -4363,13 +4374,13 @@
       <w:pPr>
         <w:pStyle w:val="Ttulo1"/>
       </w:pPr>
-      <w:bookmarkStart w:id="11" w:name="_Toc212111559"/>
-      <w:bookmarkStart w:id="12" w:name="_Hlk215856105"/>
-      <w:bookmarkEnd w:id="9"/>
+      <w:bookmarkStart w:id="13" w:name="_Toc212111559"/>
+      <w:bookmarkStart w:id="14" w:name="_Hlk215856105"/>
+      <w:bookmarkEnd w:id="11"/>
       <w:r>
         <w:t>Roles en Scrum adaptados a un solo desarrollador</w:t>
       </w:r>
-      <w:bookmarkEnd w:id="11"/>
+      <w:bookmarkEnd w:id="13"/>
     </w:p>
     <w:p>
       <w:pPr>
@@ -4398,14 +4409,14 @@
           <w:rStyle w:val="Ttulo3Car"/>
         </w:rPr>
       </w:pPr>
-      <w:bookmarkStart w:id="13" w:name="_Toc212111560"/>
+      <w:bookmarkStart w:id="15" w:name="_Toc212111560"/>
       <w:r>
         <w:rPr>
           <w:rStyle w:val="Ttulo3Car"/>
         </w:rPr>
         <w:t>Scrum Master</w:t>
       </w:r>
-      <w:bookmarkEnd w:id="13"/>
+      <w:bookmarkEnd w:id="15"/>
     </w:p>
     <w:p>
       <w:pPr>
@@ -4425,7 +4436,7 @@
         </w:rPr>
         <w:t>Es el responsable de asegurar que las prácticas de Scrum se apliquen de forma correcta. Define qué se va a desarrollar y cuáles son las prioridades del proyecto. También funge como representante del proyecto, facilitando, guiando, eliminando obstáculos y asegurando que las prácticas de Scrum se mantengan durante el proceso</w:t>
       </w:r>
-      <w:bookmarkStart w:id="14" w:name="_Toc212111561"/>
+      <w:bookmarkStart w:id="16" w:name="_Toc212111561"/>
     </w:p>
     <w:p>
       <w:pPr>
@@ -4441,7 +4452,7 @@
         </w:rPr>
         <w:t>Development Team (Equipo de desarrollo)</w:t>
       </w:r>
-      <w:bookmarkEnd w:id="14"/>
+      <w:bookmarkEnd w:id="16"/>
     </w:p>
     <w:p>
       <w:pPr>
@@ -4470,14 +4481,14 @@
           <w:rStyle w:val="Ttulo3Car"/>
         </w:rPr>
       </w:pPr>
-      <w:bookmarkStart w:id="15" w:name="_Toc212111562"/>
+      <w:bookmarkStart w:id="17" w:name="_Toc212111562"/>
       <w:r>
         <w:rPr>
           <w:rStyle w:val="Ttulo3Car"/>
         </w:rPr>
         <w:t>Product Owner</w:t>
       </w:r>
-      <w:bookmarkEnd w:id="15"/>
+      <w:bookmarkEnd w:id="17"/>
     </w:p>
     <w:p>
       <w:pPr>
@@ -4717,12 +4728,13 @@
       <w:pPr>
         <w:pStyle w:val="Ttulo1"/>
       </w:pPr>
-      <w:bookmarkStart w:id="16" w:name="_Toc212111563"/>
-      <w:bookmarkEnd w:id="12"/>
+      <w:bookmarkStart w:id="18" w:name="_Toc212111563"/>
+      <w:bookmarkEnd w:id="10"/>
+      <w:bookmarkEnd w:id="14"/>
       <w:r>
         <w:t>Análisis y levantamiento de requisitos</w:t>
       </w:r>
-      <w:bookmarkEnd w:id="16"/>
+      <w:bookmarkEnd w:id="18"/>
       <w:r>
         <w:t xml:space="preserve"> </w:t>
       </w:r>
@@ -4747,12 +4759,12 @@
       <w:pPr>
         <w:pStyle w:val="Ttulo2"/>
       </w:pPr>
-      <w:bookmarkStart w:id="17" w:name="_Toc212111564"/>
+      <w:bookmarkStart w:id="19" w:name="_Toc212111564"/>
       <w:r>
         <w:lastRenderedPageBreak/>
         <w:t>El levantamiento de requisitos se realizó tomando en cuenta:</w:t>
       </w:r>
-      <w:bookmarkEnd w:id="17"/>
+      <w:bookmarkEnd w:id="19"/>
     </w:p>
     <w:p>
       <w:pPr>
@@ -4884,11 +4896,11 @@
       <w:pPr>
         <w:pStyle w:val="Ttulo3"/>
       </w:pPr>
-      <w:bookmarkStart w:id="18" w:name="_Toc212111565"/>
+      <w:bookmarkStart w:id="20" w:name="_Toc212111565"/>
       <w:r>
         <w:t>Requisitos funcionales:</w:t>
       </w:r>
-      <w:bookmarkEnd w:id="18"/>
+      <w:bookmarkEnd w:id="20"/>
     </w:p>
     <w:p>
       <w:pPr>
@@ -4970,11 +4982,11 @@
       <w:pPr>
         <w:pStyle w:val="Ttulo3"/>
       </w:pPr>
-      <w:bookmarkStart w:id="19" w:name="_Toc212111566"/>
+      <w:bookmarkStart w:id="21" w:name="_Toc212111566"/>
       <w:r>
         <w:t>Requisitos no funcionales:</w:t>
       </w:r>
-      <w:bookmarkEnd w:id="19"/>
+      <w:bookmarkEnd w:id="21"/>
     </w:p>
     <w:p>
       <w:pPr>
@@ -5056,12 +5068,12 @@
       <w:pPr>
         <w:pStyle w:val="Ttulo1"/>
       </w:pPr>
-      <w:bookmarkStart w:id="20" w:name="_Toc212111567"/>
+      <w:bookmarkStart w:id="22" w:name="_Toc212111567"/>
       <w:r>
         <w:lastRenderedPageBreak/>
         <w:t>Historias de usuario</w:t>
       </w:r>
-      <w:bookmarkEnd w:id="20"/>
+      <w:bookmarkEnd w:id="22"/>
     </w:p>
     <w:p>
       <w:pPr>
@@ -5082,11 +5094,11 @@
       <w:pPr>
         <w:pStyle w:val="Ttulo2"/>
       </w:pPr>
-      <w:bookmarkStart w:id="21" w:name="_Toc212111568"/>
+      <w:bookmarkStart w:id="23" w:name="_Toc212111568"/>
       <w:r>
         <w:t>Base Original</w:t>
       </w:r>
-      <w:bookmarkEnd w:id="21"/>
+      <w:bookmarkEnd w:id="23"/>
     </w:p>
     <w:p>
       <w:pPr>
@@ -5251,11 +5263,11 @@
       <w:pPr>
         <w:pStyle w:val="Ttulo2"/>
       </w:pPr>
-      <w:bookmarkStart w:id="22" w:name="_Toc212111569"/>
+      <w:bookmarkStart w:id="24" w:name="_Toc212111569"/>
       <w:r>
         <w:t>Adicionado después</w:t>
       </w:r>
-      <w:bookmarkEnd w:id="22"/>
+      <w:bookmarkEnd w:id="24"/>
       <w:r>
         <w:t xml:space="preserve"> </w:t>
       </w:r>
@@ -5321,11 +5333,11 @@
       <w:pPr>
         <w:pStyle w:val="Ttulo2"/>
       </w:pPr>
-      <w:bookmarkStart w:id="23" w:name="_Toc212111570"/>
+      <w:bookmarkStart w:id="25" w:name="_Toc212111570"/>
       <w:r>
         <w:t>Product Backlog</w:t>
       </w:r>
-      <w:bookmarkEnd w:id="23"/>
+      <w:bookmarkEnd w:id="25"/>
     </w:p>
     <w:p>
       <w:pPr>
@@ -5393,11 +5405,11 @@
       <w:pPr>
         <w:pStyle w:val="Ttulo2"/>
       </w:pPr>
-      <w:bookmarkStart w:id="24" w:name="_Toc212111571"/>
+      <w:bookmarkStart w:id="26" w:name="_Toc212111571"/>
       <w:r>
         <w:t>Sprint</w:t>
       </w:r>
-      <w:bookmarkEnd w:id="24"/>
+      <w:bookmarkEnd w:id="26"/>
     </w:p>
     <w:p>
       <w:pPr>
@@ -5536,11 +5548,11 @@
       <w:pPr>
         <w:pStyle w:val="Ttulo1"/>
       </w:pPr>
-      <w:bookmarkStart w:id="25" w:name="_Toc212111572"/>
+      <w:bookmarkStart w:id="27" w:name="_Toc212111572"/>
       <w:r>
         <w:t>Diseño de interfaces</w:t>
       </w:r>
-      <w:bookmarkEnd w:id="25"/>
+      <w:bookmarkEnd w:id="27"/>
       <w:r>
         <w:t xml:space="preserve"> </w:t>
       </w:r>
@@ -5766,12 +5778,12 @@
       <w:pPr>
         <w:pStyle w:val="Ttulo1"/>
       </w:pPr>
-      <w:bookmarkStart w:id="26" w:name="_Toc212111573"/>
+      <w:bookmarkStart w:id="28" w:name="_Toc212111573"/>
       <w:r>
         <w:lastRenderedPageBreak/>
         <w:t>Diseño de la arquitectura</w:t>
       </w:r>
-      <w:bookmarkEnd w:id="26"/>
+      <w:bookmarkEnd w:id="28"/>
     </w:p>
     <w:p>
       <w:pPr>
@@ -5908,7 +5920,7 @@
           <w:szCs w:val="24"/>
         </w:rPr>
       </w:pPr>
-      <w:bookmarkStart w:id="27" w:name="_Hlk208921548"/>
+      <w:bookmarkStart w:id="29" w:name="_Hlk208921548"/>
       <w:r>
         <w:rPr>
           <w:rFonts w:cs="Arial"/>
@@ -5925,7 +5937,7 @@
         </w:rPr>
         <w:t xml:space="preserve"> </w:t>
       </w:r>
-      <w:bookmarkEnd w:id="27"/>
+      <w:bookmarkEnd w:id="29"/>
       <w:r>
         <w:rPr>
           <w:rFonts w:cs="Arial"/>
@@ -6004,11 +6016,11 @@
       <w:pPr>
         <w:pStyle w:val="Ttulo2"/>
       </w:pPr>
-      <w:bookmarkStart w:id="28" w:name="_Toc212111574"/>
+      <w:bookmarkStart w:id="30" w:name="_Toc212111574"/>
       <w:r>
         <w:t>PowerShell</w:t>
       </w:r>
-      <w:bookmarkEnd w:id="28"/>
+      <w:bookmarkEnd w:id="30"/>
     </w:p>
     <w:p>
       <w:pPr>
@@ -6146,14 +6158,14 @@
       <w:pPr>
         <w:pStyle w:val="Ttulo2"/>
       </w:pPr>
-      <w:bookmarkStart w:id="29" w:name="_Toc212111575"/>
+      <w:bookmarkStart w:id="31" w:name="_Toc212111575"/>
       <w:r>
         <w:t>B</w:t>
       </w:r>
       <w:r>
         <w:t>atch</w:t>
       </w:r>
-      <w:bookmarkEnd w:id="29"/>
+      <w:bookmarkEnd w:id="31"/>
     </w:p>
     <w:p>
       <w:pPr>
@@ -6270,12 +6282,12 @@
       <w:pPr>
         <w:pStyle w:val="Ttulo2"/>
       </w:pPr>
-      <w:bookmarkStart w:id="30" w:name="_Toc212111576"/>
+      <w:bookmarkStart w:id="32" w:name="_Toc212111576"/>
       <w:r>
         <w:lastRenderedPageBreak/>
         <w:t>Bash (Bourne Again Shell)</w:t>
       </w:r>
-      <w:bookmarkEnd w:id="30"/>
+      <w:bookmarkEnd w:id="32"/>
     </w:p>
     <w:p>
       <w:pPr>
@@ -6373,11 +6385,11 @@
       <w:pPr>
         <w:pStyle w:val="Ttulo2"/>
       </w:pPr>
-      <w:bookmarkStart w:id="31" w:name="_Toc212111577"/>
+      <w:bookmarkStart w:id="33" w:name="_Toc212111577"/>
       <w:r>
         <w:t>Python</w:t>
       </w:r>
-      <w:bookmarkEnd w:id="31"/>
+      <w:bookmarkEnd w:id="33"/>
     </w:p>
     <w:p>
       <w:pPr>
@@ -6475,11 +6487,11 @@
       <w:pPr>
         <w:pStyle w:val="Ttulo2"/>
       </w:pPr>
-      <w:bookmarkStart w:id="32" w:name="_Toc212111578"/>
+      <w:bookmarkStart w:id="34" w:name="_Toc212111578"/>
       <w:r>
         <w:t>Visual Studio Code</w:t>
       </w:r>
-      <w:bookmarkEnd w:id="32"/>
+      <w:bookmarkEnd w:id="34"/>
     </w:p>
     <w:p>
       <w:pPr>
@@ -6578,11 +6590,11 @@
       <w:pPr>
         <w:pStyle w:val="Ttulo1"/>
       </w:pPr>
-      <w:bookmarkStart w:id="33" w:name="_Toc212111579"/>
+      <w:bookmarkStart w:id="35" w:name="_Toc212111579"/>
       <w:r>
         <w:t>Resultados</w:t>
       </w:r>
-      <w:bookmarkEnd w:id="33"/>
+      <w:bookmarkEnd w:id="35"/>
     </w:p>
     <w:p>
       <w:pPr>
@@ -6628,11 +6640,11 @@
       <w:pPr>
         <w:pStyle w:val="Ttulo3"/>
       </w:pPr>
-      <w:bookmarkStart w:id="34" w:name="_Toc212111580"/>
+      <w:bookmarkStart w:id="36" w:name="_Toc212111580"/>
       <w:r>
         <w:t>1. Integración inicial</w:t>
       </w:r>
-      <w:bookmarkEnd w:id="34"/>
+      <w:bookmarkEnd w:id="36"/>
     </w:p>
     <w:p>
       <w:pPr>
@@ -6710,11 +6722,11 @@
       <w:pPr>
         <w:pStyle w:val="Ttulo3"/>
       </w:pPr>
-      <w:bookmarkStart w:id="35" w:name="_Toc212111581"/>
+      <w:bookmarkStart w:id="37" w:name="_Toc212111581"/>
       <w:r>
         <w:t>2. Requerimientos del sistema</w:t>
       </w:r>
-      <w:bookmarkEnd w:id="35"/>
+      <w:bookmarkEnd w:id="37"/>
     </w:p>
     <w:p>
       <w:pPr>
@@ -6846,11 +6858,11 @@
       <w:pPr>
         <w:pStyle w:val="Ttulo3"/>
       </w:pPr>
-      <w:bookmarkStart w:id="36" w:name="_Toc212111582"/>
+      <w:bookmarkStart w:id="38" w:name="_Toc212111582"/>
       <w:r>
         <w:t>3. Funcionalidades adicionadas posteriormente</w:t>
       </w:r>
-      <w:bookmarkEnd w:id="36"/>
+      <w:bookmarkEnd w:id="38"/>
     </w:p>
     <w:p>
       <w:pPr>
@@ -6947,11 +6959,11 @@
       <w:pPr>
         <w:pStyle w:val="Ttulo2"/>
       </w:pPr>
-      <w:bookmarkStart w:id="37" w:name="_Toc212111583"/>
+      <w:bookmarkStart w:id="39" w:name="_Toc212111583"/>
       <w:r>
         <w:t>Seguridad</w:t>
       </w:r>
-      <w:bookmarkEnd w:id="37"/>
+      <w:bookmarkEnd w:id="39"/>
     </w:p>
     <w:p>
       <w:pPr>
@@ -7004,11 +7016,11 @@
       <w:pPr>
         <w:pStyle w:val="Ttulo2"/>
       </w:pPr>
-      <w:bookmarkStart w:id="38" w:name="_Toc212111584"/>
+      <w:bookmarkStart w:id="40" w:name="_Toc212111584"/>
       <w:r>
         <w:t>Usabilidad</w:t>
       </w:r>
-      <w:bookmarkEnd w:id="38"/>
+      <w:bookmarkEnd w:id="40"/>
     </w:p>
     <w:p>
       <w:pPr>
@@ -7061,11 +7073,11 @@
       <w:pPr>
         <w:pStyle w:val="Ttulo2"/>
       </w:pPr>
-      <w:bookmarkStart w:id="39" w:name="_Toc212111585"/>
+      <w:bookmarkStart w:id="41" w:name="_Toc212111585"/>
       <w:r>
         <w:t>Disponibilidad</w:t>
       </w:r>
-      <w:bookmarkEnd w:id="39"/>
+      <w:bookmarkEnd w:id="41"/>
     </w:p>
     <w:p>
       <w:pPr>
@@ -7102,11 +7114,11 @@
       <w:pPr>
         <w:pStyle w:val="Ttulo2"/>
       </w:pPr>
-      <w:bookmarkStart w:id="40" w:name="_Toc212111586"/>
+      <w:bookmarkStart w:id="42" w:name="_Toc212111586"/>
       <w:r>
         <w:t>Creación del proyecto en Visual Studio Code</w:t>
       </w:r>
-      <w:bookmarkEnd w:id="40"/>
+      <w:bookmarkEnd w:id="42"/>
     </w:p>
     <w:p>
       <w:pPr>
@@ -7326,7 +7338,7 @@
       <w:pPr>
         <w:pStyle w:val="Ttulo2"/>
       </w:pPr>
-      <w:bookmarkStart w:id="41" w:name="_Toc212111587"/>
+      <w:bookmarkStart w:id="43" w:name="_Toc212111587"/>
       <w:r>
         <w:t>Sprint 1</w:t>
       </w:r>
@@ -7336,7 +7348,7 @@
       <w:r>
         <w:t>– Planificación e Investigación</w:t>
       </w:r>
-      <w:bookmarkEnd w:id="41"/>
+      <w:bookmarkEnd w:id="43"/>
     </w:p>
     <w:p>
       <w:pPr>
@@ -7388,7 +7400,7 @@
       <w:pPr>
         <w:pStyle w:val="Ttulo2"/>
       </w:pPr>
-      <w:bookmarkStart w:id="42" w:name="_Toc212111588"/>
+      <w:bookmarkStart w:id="44" w:name="_Toc212111588"/>
       <w:r>
         <w:t>Sprint 2</w:t>
       </w:r>
@@ -7398,7 +7410,7 @@
       <w:r>
         <w:t>– Diseño de la Aplicación</w:t>
       </w:r>
-      <w:bookmarkEnd w:id="42"/>
+      <w:bookmarkEnd w:id="44"/>
     </w:p>
     <w:p>
       <w:pPr>
@@ -7573,14 +7585,14 @@
       <w:pPr>
         <w:pStyle w:val="Ttulo2"/>
       </w:pPr>
-      <w:bookmarkStart w:id="43" w:name="_Toc212111589"/>
+      <w:bookmarkStart w:id="45" w:name="_Toc212111589"/>
       <w:r>
         <w:t xml:space="preserve">Sprint 3 </w:t>
       </w:r>
       <w:r>
         <w:t>– Desarrollo e Implementación</w:t>
       </w:r>
-      <w:bookmarkEnd w:id="43"/>
+      <w:bookmarkEnd w:id="45"/>
     </w:p>
     <w:p>
       <w:pPr>
@@ -7615,11 +7627,11 @@
       <w:pPr>
         <w:pStyle w:val="Ttulo2"/>
       </w:pPr>
-      <w:bookmarkStart w:id="44" w:name="_Toc212111590"/>
+      <w:bookmarkStart w:id="46" w:name="_Toc212111590"/>
       <w:r>
         <w:t>Sprint 4 – Pruebas y Optimización</w:t>
       </w:r>
-      <w:bookmarkEnd w:id="44"/>
+      <w:bookmarkEnd w:id="46"/>
     </w:p>
     <w:p>
       <w:pPr>
@@ -7640,21 +7652,21 @@
       <w:pPr>
         <w:pStyle w:val="Ttulo1"/>
       </w:pPr>
-      <w:bookmarkStart w:id="45" w:name="_Toc212111591"/>
+      <w:bookmarkStart w:id="47" w:name="_Toc212111591"/>
       <w:r>
         <w:t>Conclusiones y Recomendaciones</w:t>
       </w:r>
-      <w:bookmarkEnd w:id="45"/>
+      <w:bookmarkEnd w:id="47"/>
     </w:p>
     <w:p>
       <w:pPr>
         <w:pStyle w:val="Ttulo2"/>
       </w:pPr>
-      <w:bookmarkStart w:id="46" w:name="_Toc212111592"/>
+      <w:bookmarkStart w:id="48" w:name="_Toc212111592"/>
       <w:r>
         <w:t>Conclusiones</w:t>
       </w:r>
-      <w:bookmarkEnd w:id="46"/>
+      <w:bookmarkEnd w:id="48"/>
     </w:p>
     <w:p>
       <w:pPr>
@@ -7753,12 +7765,12 @@
       <w:pPr>
         <w:pStyle w:val="Ttulo2"/>
       </w:pPr>
-      <w:bookmarkStart w:id="47" w:name="_Toc212111593"/>
+      <w:bookmarkStart w:id="49" w:name="_Toc212111593"/>
       <w:r>
         <w:lastRenderedPageBreak/>
         <w:t>Recomendaciones</w:t>
       </w:r>
-      <w:bookmarkEnd w:id="47"/>
+      <w:bookmarkEnd w:id="49"/>
       <w:r>
         <w:t xml:space="preserve"> </w:t>
       </w:r>
@@ -7957,11 +7969,11 @@
       <w:pPr>
         <w:pStyle w:val="Ttulo1"/>
       </w:pPr>
-      <w:bookmarkStart w:id="48" w:name="_Toc212111594"/>
+      <w:bookmarkStart w:id="50" w:name="_Toc212111594"/>
       <w:r>
         <w:t>Problemas Dentro de la Programación</w:t>
       </w:r>
-      <w:bookmarkEnd w:id="48"/>
+      <w:bookmarkEnd w:id="50"/>
     </w:p>
     <w:p>
       <w:pPr>
@@ -8223,11 +8235,11 @@
       <w:pPr>
         <w:pStyle w:val="Ttulo2"/>
       </w:pPr>
-      <w:bookmarkStart w:id="49" w:name="_Toc212111595"/>
+      <w:bookmarkStart w:id="51" w:name="_Toc212111595"/>
       <w:r>
         <w:t>Modificaciones</w:t>
       </w:r>
-      <w:bookmarkEnd w:id="49"/>
+      <w:bookmarkEnd w:id="51"/>
     </w:p>
     <w:p>
       <w:pPr>
@@ -8391,12 +8403,12 @@
       <w:pPr>
         <w:pStyle w:val="Ttulo1"/>
       </w:pPr>
-      <w:bookmarkStart w:id="50" w:name="_Toc212111596"/>
+      <w:bookmarkStart w:id="52" w:name="_Toc212111596"/>
       <w:r>
         <w:lastRenderedPageBreak/>
         <w:t>Resultados</w:t>
       </w:r>
-      <w:bookmarkEnd w:id="50"/>
+      <w:bookmarkEnd w:id="52"/>
     </w:p>
     <w:p>
       <w:pPr>
@@ -8972,6 +8984,15 @@
           <w:bCs/>
           <w:szCs w:val="24"/>
         </w:rPr>
+        <w:t>c</w:t>
+      </w:r>
+      <w:r>
+        <w:rPr>
+          <w:rFonts w:ascii="Arial" w:hAnsi="Arial" w:cs="Arial"/>
+          <w:b/>
+          <w:bCs/>
+          <w:szCs w:val="24"/>
+        </w:rPr>
         <w:t>arpetas de usuario en macOS</w:t>
       </w:r>
     </w:p>
@@ -9502,11 +9523,11 @@
       <w:pPr>
         <w:pStyle w:val="Ttulo2"/>
       </w:pPr>
-      <w:bookmarkStart w:id="51" w:name="_Toc212111597"/>
+      <w:bookmarkStart w:id="53" w:name="_Toc212111597"/>
       <w:r>
         <w:t>Recomendaciones Externas</w:t>
       </w:r>
-      <w:bookmarkEnd w:id="51"/>
+      <w:bookmarkEnd w:id="53"/>
       <w:r>
         <w:t xml:space="preserve"> </w:t>
       </w:r>
@@ -10327,11 +10348,11 @@
       <w:pPr>
         <w:pStyle w:val="Ttulo1"/>
       </w:pPr>
-      <w:bookmarkStart w:id="52" w:name="_Toc212111598"/>
+      <w:bookmarkStart w:id="54" w:name="_Toc212111598"/>
       <w:r>
         <w:t>Referencias Bibliográficas</w:t>
       </w:r>
-      <w:bookmarkEnd w:id="52"/>
+      <w:bookmarkEnd w:id="54"/>
     </w:p>
     <w:p>
       <w:pPr>
@@ -15734,6 +15755,7 @@
   <w:style w:type="character" w:default="1" w:styleId="Fuentedeprrafopredeter">
     <w:name w:val="Default Paragraph Font"/>
     <w:uiPriority w:val="1"/>
+    <w:semiHidden/>
     <w:unhideWhenUsed/>
   </w:style>
   <w:style w:type="table" w:default="1" w:styleId="Tablanormal">

</xml_diff>